<commit_message>
Implemented April 29 2026 feedback
</commit_message>
<xml_diff>
--- a/docassemble/RentalRepairLetter/data/templates/rental_repair_letter.docx
+++ b/docassemble/RentalRepairLetter/data/templates/rental_repair_letter.docx
@@ -21,23 +21,52 @@
         <w:rPr>
           <w:color w:val="000000"/>
         </w:rPr>
+        <w:t>delivery_</w:t>
+      </w:r>
+      <w:proofErr w:type="gramStart"/>
+      <w:r>
+        <w:rPr>
+          <w:color w:val="000000"/>
+        </w:rPr>
+        <w:t>date</w:t>
+      </w:r>
+      <w:proofErr w:type="spellEnd"/>
+      <w:r>
+        <w:rPr>
+          <w:color w:val="000000"/>
+        </w:rPr>
+        <w:t xml:space="preserve"> !</w:t>
+      </w:r>
+      <w:proofErr w:type="gramEnd"/>
+      <w:r>
+        <w:rPr>
+          <w:color w:val="000000"/>
+        </w:rPr>
+        <w:t xml:space="preserve">= “” </w:t>
+      </w:r>
+      <w:proofErr w:type="gramStart"/>
+      <w:r>
+        <w:rPr>
+          <w:color w:val="000000"/>
+        </w:rPr>
+        <w:t>%}{</w:t>
+      </w:r>
+      <w:proofErr w:type="gramEnd"/>
+      <w:r>
+        <w:rPr>
+          <w:color w:val="000000"/>
+        </w:rPr>
+        <w:t>{</w:t>
+      </w:r>
+      <w:proofErr w:type="spellStart"/>
+      <w:r>
+        <w:rPr>
+          <w:color w:val="000000"/>
+        </w:rPr>
         <w:t>delivery_date</w:t>
       </w:r>
       <w:proofErr w:type="spellEnd"/>
-      <w:r>
-        <w:rPr>
-          <w:color w:val="000000"/>
-        </w:rPr>
-        <w:t xml:space="preserve"> != “” %}{{</w:t>
-      </w:r>
-      <w:proofErr w:type="spellStart"/>
-      <w:r>
-        <w:rPr>
-          <w:color w:val="000000"/>
-        </w:rPr>
-        <w:t>delivery_date</w:t>
-      </w:r>
-      <w:proofErr w:type="spellEnd"/>
+      <w:proofErr w:type="gramStart"/>
       <w:r>
         <w:rPr>
           <w:color w:val="000000"/>
@@ -48,7 +77,28 @@
         <w:rPr>
           <w:color w:val="000000"/>
         </w:rPr>
-        <w:t>{% else %}_____________</w:t>
+        <w:t>{</w:t>
+      </w:r>
+      <w:proofErr w:type="gramEnd"/>
+      <w:r>
+        <w:rPr>
+          <w:color w:val="000000"/>
+        </w:rPr>
+        <w:t xml:space="preserve">% else </w:t>
+      </w:r>
+      <w:proofErr w:type="gramStart"/>
+      <w:r>
+        <w:rPr>
+          <w:color w:val="000000"/>
+        </w:rPr>
+        <w:t>%}_</w:t>
+      </w:r>
+      <w:proofErr w:type="gramEnd"/>
+      <w:r>
+        <w:rPr>
+          <w:color w:val="000000"/>
+        </w:rPr>
+        <w:t>____________</w:t>
       </w:r>
     </w:p>
     <w:p>
@@ -83,14 +133,38 @@
           <w:sz w:val="20"/>
           <w:szCs w:val="20"/>
         </w:rPr>
-        <w:t>(Date)</w:t>
-      </w:r>
-      <w:r>
-        <w:rPr>
-          <w:color w:val="000000"/>
-        </w:rPr>
-        <w:t>{% endif %}</w:t>
-      </w:r>
+        <w:t>(Date</w:t>
+      </w:r>
+      <w:proofErr w:type="gramStart"/>
+      <w:r>
+        <w:rPr>
+          <w:color w:val="000000"/>
+          <w:sz w:val="20"/>
+          <w:szCs w:val="20"/>
+        </w:rPr>
+        <w:t>)</w:t>
+      </w:r>
+      <w:r>
+        <w:rPr>
+          <w:color w:val="000000"/>
+        </w:rPr>
+        <w:t>{</w:t>
+      </w:r>
+      <w:proofErr w:type="gramEnd"/>
+      <w:r>
+        <w:rPr>
+          <w:color w:val="000000"/>
+        </w:rPr>
+        <w:t xml:space="preserve">% </w:t>
+      </w:r>
+      <w:proofErr w:type="gramStart"/>
+      <w:r>
+        <w:rPr>
+          <w:color w:val="000000"/>
+        </w:rPr>
+        <w:t>endif %}</w:t>
+      </w:r>
+      <w:proofErr w:type="gramEnd"/>
     </w:p>
     <w:p>
       <w:pPr>
@@ -129,13 +203,27 @@
         <w:rPr>
           <w:color w:val="000000"/>
         </w:rPr>
-        <w:t xml:space="preserve"> %}</w:t>
-      </w:r>
-      <w:r>
-        <w:rPr>
-          <w:color w:val="000000"/>
-        </w:rPr>
-        <w:t>{{</w:t>
+        <w:t xml:space="preserve"> </w:t>
+      </w:r>
+      <w:proofErr w:type="gramStart"/>
+      <w:r>
+        <w:rPr>
+          <w:color w:val="000000"/>
+        </w:rPr>
+        <w:t>%}</w:t>
+      </w:r>
+      <w:r>
+        <w:rPr>
+          <w:color w:val="000000"/>
+        </w:rPr>
+        <w:t>{</w:t>
+      </w:r>
+      <w:proofErr w:type="gramEnd"/>
+      <w:r>
+        <w:rPr>
+          <w:color w:val="000000"/>
+        </w:rPr>
+        <w:t>{</w:t>
       </w:r>
       <w:proofErr w:type="spellStart"/>
       <w:r>
@@ -148,15 +236,30 @@
         <w:rPr>
           <w:color w:val="000000"/>
         </w:rPr>
-        <w:t>name_full</w:t>
-      </w:r>
-      <w:proofErr w:type="spellEnd"/>
-      <w:r>
-        <w:rPr>
-          <w:color w:val="000000"/>
-        </w:rPr>
-        <w:t>()</w:t>
-      </w:r>
+        <w:t>name_</w:t>
+      </w:r>
+      <w:proofErr w:type="gramStart"/>
+      <w:r>
+        <w:rPr>
+          <w:color w:val="000000"/>
+        </w:rPr>
+        <w:t>full</w:t>
+      </w:r>
+      <w:proofErr w:type="spellEnd"/>
+      <w:r>
+        <w:rPr>
+          <w:color w:val="000000"/>
+        </w:rPr>
+        <w:t>(</w:t>
+      </w:r>
+      <w:proofErr w:type="gramEnd"/>
+      <w:r>
+        <w:rPr>
+          <w:color w:val="000000"/>
+        </w:rPr>
+        <w:t>)</w:t>
+      </w:r>
+      <w:proofErr w:type="gramStart"/>
       <w:r>
         <w:rPr>
           <w:color w:val="000000"/>
@@ -167,7 +270,14 @@
         <w:rPr>
           <w:color w:val="000000"/>
         </w:rPr>
-        <w:t>{% endif %}</w:t>
+        <w:t>{</w:t>
+      </w:r>
+      <w:proofErr w:type="gramEnd"/>
+      <w:r>
+        <w:rPr>
+          <w:color w:val="000000"/>
+        </w:rPr>
+        <w:t>% endif %}</w:t>
       </w:r>
     </w:p>
     <w:p>
@@ -197,33 +307,69 @@
         <w:rPr>
           <w:color w:val="000000"/>
         </w:rPr>
-        <w:t xml:space="preserve"> %}</w:t>
-      </w:r>
-      <w:r>
-        <w:rPr>
-          <w:color w:val="000000"/>
-        </w:rPr>
-        <w:t>{{</w:t>
-      </w:r>
-      <w:proofErr w:type="spellStart"/>
-      <w:r>
-        <w:rPr>
-          <w:color w:val="000000"/>
-        </w:rPr>
-        <w:t>landlord.address.line_one</w:t>
-      </w:r>
-      <w:proofErr w:type="spellEnd"/>
-      <w:r>
-        <w:rPr>
-          <w:color w:val="000000"/>
-        </w:rPr>
-        <w:t>(bare=True)}}</w:t>
-      </w:r>
-      <w:r>
-        <w:rPr>
-          <w:color w:val="000000"/>
-        </w:rPr>
-        <w:t>{% endif %}</w:t>
+        <w:t xml:space="preserve"> </w:t>
+      </w:r>
+      <w:proofErr w:type="gramStart"/>
+      <w:r>
+        <w:rPr>
+          <w:color w:val="000000"/>
+        </w:rPr>
+        <w:t>%}</w:t>
+      </w:r>
+      <w:r>
+        <w:rPr>
+          <w:color w:val="000000"/>
+        </w:rPr>
+        <w:t>{</w:t>
+      </w:r>
+      <w:proofErr w:type="gramEnd"/>
+      <w:r>
+        <w:rPr>
+          <w:color w:val="000000"/>
+        </w:rPr>
+        <w:t>{</w:t>
+      </w:r>
+      <w:proofErr w:type="spellStart"/>
+      <w:proofErr w:type="gramStart"/>
+      <w:r>
+        <w:rPr>
+          <w:color w:val="000000"/>
+        </w:rPr>
+        <w:t>landlord.address</w:t>
+      </w:r>
+      <w:proofErr w:type="gramEnd"/>
+      <w:r>
+        <w:rPr>
+          <w:color w:val="000000"/>
+        </w:rPr>
+        <w:t>.line_one</w:t>
+      </w:r>
+      <w:proofErr w:type="spellEnd"/>
+      <w:r>
+        <w:rPr>
+          <w:color w:val="000000"/>
+        </w:rPr>
+        <w:t>(bare=True)</w:t>
+      </w:r>
+      <w:proofErr w:type="gramStart"/>
+      <w:r>
+        <w:rPr>
+          <w:color w:val="000000"/>
+        </w:rPr>
+        <w:t>}}</w:t>
+      </w:r>
+      <w:r>
+        <w:rPr>
+          <w:color w:val="000000"/>
+        </w:rPr>
+        <w:t>{</w:t>
+      </w:r>
+      <w:proofErr w:type="gramEnd"/>
+      <w:r>
+        <w:rPr>
+          <w:color w:val="000000"/>
+        </w:rPr>
+        <w:t>% endif %}</w:t>
       </w:r>
     </w:p>
     <w:p>
@@ -253,33 +399,83 @@
         <w:rPr>
           <w:color w:val="000000"/>
         </w:rPr>
-        <w:t xml:space="preserve"> %}</w:t>
-      </w:r>
-      <w:r>
-        <w:rPr>
-          <w:color w:val="000000"/>
-        </w:rPr>
-        <w:t>{{</w:t>
-      </w:r>
-      <w:proofErr w:type="spellStart"/>
-      <w:r>
-        <w:rPr>
-          <w:color w:val="000000"/>
-        </w:rPr>
-        <w:t>landlord.address.line_two</w:t>
-      </w:r>
-      <w:proofErr w:type="spellEnd"/>
-      <w:r>
-        <w:rPr>
-          <w:color w:val="000000"/>
-        </w:rPr>
-        <w:t>()}}</w:t>
-      </w:r>
-      <w:r>
-        <w:rPr>
-          <w:color w:val="000000"/>
-        </w:rPr>
-        <w:t>{% endif %}</w:t>
+        <w:t xml:space="preserve"> </w:t>
+      </w:r>
+      <w:proofErr w:type="gramStart"/>
+      <w:r>
+        <w:rPr>
+          <w:color w:val="000000"/>
+        </w:rPr>
+        <w:t>%}</w:t>
+      </w:r>
+      <w:r>
+        <w:rPr>
+          <w:color w:val="000000"/>
+        </w:rPr>
+        <w:t>{</w:t>
+      </w:r>
+      <w:proofErr w:type="gramEnd"/>
+      <w:r>
+        <w:rPr>
+          <w:color w:val="000000"/>
+        </w:rPr>
+        <w:t>{</w:t>
+      </w:r>
+      <w:proofErr w:type="spellStart"/>
+      <w:proofErr w:type="gramStart"/>
+      <w:r>
+        <w:rPr>
+          <w:color w:val="000000"/>
+        </w:rPr>
+        <w:t>landlord.address</w:t>
+      </w:r>
+      <w:proofErr w:type="gramEnd"/>
+      <w:r>
+        <w:rPr>
+          <w:color w:val="000000"/>
+        </w:rPr>
+        <w:t>.line_</w:t>
+      </w:r>
+      <w:proofErr w:type="gramStart"/>
+      <w:r>
+        <w:rPr>
+          <w:color w:val="000000"/>
+        </w:rPr>
+        <w:t>two</w:t>
+      </w:r>
+      <w:proofErr w:type="spellEnd"/>
+      <w:r>
+        <w:rPr>
+          <w:color w:val="000000"/>
+        </w:rPr>
+        <w:t>(</w:t>
+      </w:r>
+      <w:proofErr w:type="gramEnd"/>
+      <w:r>
+        <w:rPr>
+          <w:color w:val="000000"/>
+        </w:rPr>
+        <w:t>)</w:t>
+      </w:r>
+      <w:proofErr w:type="gramStart"/>
+      <w:r>
+        <w:rPr>
+          <w:color w:val="000000"/>
+        </w:rPr>
+        <w:t>}}</w:t>
+      </w:r>
+      <w:r>
+        <w:rPr>
+          <w:color w:val="000000"/>
+        </w:rPr>
+        <w:t>{</w:t>
+      </w:r>
+      <w:proofErr w:type="gramEnd"/>
+      <w:r>
+        <w:rPr>
+          <w:color w:val="000000"/>
+        </w:rPr>
+        <w:t>% endif %}</w:t>
       </w:r>
     </w:p>
     <w:p>
@@ -351,27 +547,83 @@
         <w:rPr>
           <w:color w:val="000000"/>
         </w:rPr>
-        <w:t xml:space="preserve"> %}Landlord of {{</w:t>
-      </w:r>
-      <w:proofErr w:type="spellStart"/>
-      <w:r>
-        <w:rPr>
-          <w:color w:val="000000"/>
-        </w:rPr>
-        <w:t>rental_property.line_one</w:t>
-      </w:r>
-      <w:proofErr w:type="spellEnd"/>
-      <w:r>
-        <w:rPr>
-          <w:color w:val="000000"/>
-        </w:rPr>
-        <w:t>(bare=True)}}{% else %}</w:t>
-      </w:r>
-      <w:r>
-        <w:rPr>
-          <w:color w:val="000000"/>
-        </w:rPr>
-        <w:t>{{</w:t>
+        <w:t xml:space="preserve"> </w:t>
+      </w:r>
+      <w:proofErr w:type="gramStart"/>
+      <w:r>
+        <w:rPr>
+          <w:color w:val="000000"/>
+        </w:rPr>
+        <w:t>%}Landlord</w:t>
+      </w:r>
+      <w:proofErr w:type="gramEnd"/>
+      <w:r>
+        <w:rPr>
+          <w:color w:val="000000"/>
+        </w:rPr>
+        <w:t xml:space="preserve"> of {{</w:t>
+      </w:r>
+      <w:proofErr w:type="spellStart"/>
+      <w:r>
+        <w:rPr>
+          <w:color w:val="000000"/>
+        </w:rPr>
+        <w:t>rental_</w:t>
+      </w:r>
+      <w:proofErr w:type="gramStart"/>
+      <w:r>
+        <w:rPr>
+          <w:color w:val="000000"/>
+        </w:rPr>
+        <w:t>property.line</w:t>
+      </w:r>
+      <w:proofErr w:type="gramEnd"/>
+      <w:r>
+        <w:rPr>
+          <w:color w:val="000000"/>
+        </w:rPr>
+        <w:t>_one</w:t>
+      </w:r>
+      <w:proofErr w:type="spellEnd"/>
+      <w:r>
+        <w:rPr>
+          <w:color w:val="000000"/>
+        </w:rPr>
+        <w:t>(bare=True)</w:t>
+      </w:r>
+      <w:proofErr w:type="gramStart"/>
+      <w:r>
+        <w:rPr>
+          <w:color w:val="000000"/>
+        </w:rPr>
+        <w:t>}}{</w:t>
+      </w:r>
+      <w:proofErr w:type="gramEnd"/>
+      <w:r>
+        <w:rPr>
+          <w:color w:val="000000"/>
+        </w:rPr>
+        <w:t xml:space="preserve">% else </w:t>
+      </w:r>
+      <w:proofErr w:type="gramStart"/>
+      <w:r>
+        <w:rPr>
+          <w:color w:val="000000"/>
+        </w:rPr>
+        <w:t>%}</w:t>
+      </w:r>
+      <w:r>
+        <w:rPr>
+          <w:color w:val="000000"/>
+        </w:rPr>
+        <w:t>{</w:t>
+      </w:r>
+      <w:proofErr w:type="gramEnd"/>
+      <w:r>
+        <w:rPr>
+          <w:color w:val="000000"/>
+        </w:rPr>
+        <w:t>{</w:t>
       </w:r>
       <w:proofErr w:type="spellStart"/>
       <w:r>
@@ -384,15 +636,30 @@
         <w:rPr>
           <w:color w:val="000000"/>
         </w:rPr>
-        <w:t>name_full</w:t>
-      </w:r>
-      <w:proofErr w:type="spellEnd"/>
-      <w:r>
-        <w:rPr>
-          <w:color w:val="000000"/>
-        </w:rPr>
-        <w:t>()</w:t>
-      </w:r>
+        <w:t>name_</w:t>
+      </w:r>
+      <w:proofErr w:type="gramStart"/>
+      <w:r>
+        <w:rPr>
+          <w:color w:val="000000"/>
+        </w:rPr>
+        <w:t>full</w:t>
+      </w:r>
+      <w:proofErr w:type="spellEnd"/>
+      <w:r>
+        <w:rPr>
+          <w:color w:val="000000"/>
+        </w:rPr>
+        <w:t>(</w:t>
+      </w:r>
+      <w:proofErr w:type="gramEnd"/>
+      <w:r>
+        <w:rPr>
+          <w:color w:val="000000"/>
+        </w:rPr>
+        <w:t>)</w:t>
+      </w:r>
+      <w:proofErr w:type="gramStart"/>
       <w:r>
         <w:rPr>
           <w:color w:val="000000"/>
@@ -403,7 +670,14 @@
         <w:rPr>
           <w:color w:val="000000"/>
         </w:rPr>
-        <w:t>{% endif %}</w:t>
+        <w:t>{</w:t>
+      </w:r>
+      <w:proofErr w:type="gramEnd"/>
+      <w:r>
+        <w:rPr>
+          <w:color w:val="000000"/>
+        </w:rPr>
+        <w:t>% endif %}</w:t>
       </w:r>
       <w:r>
         <w:rPr>
@@ -443,14 +717,28 @@
         <w:rPr>
           <w:color w:val="000000"/>
         </w:rPr>
-        <w:t>name_full</w:t>
-      </w:r>
-      <w:proofErr w:type="spellEnd"/>
-      <w:r>
-        <w:rPr>
-          <w:color w:val="000000"/>
-        </w:rPr>
-        <w:t>()</w:t>
+        <w:t>name_</w:t>
+      </w:r>
+      <w:proofErr w:type="gramStart"/>
+      <w:r>
+        <w:rPr>
+          <w:color w:val="000000"/>
+        </w:rPr>
+        <w:t>full</w:t>
+      </w:r>
+      <w:proofErr w:type="spellEnd"/>
+      <w:r>
+        <w:rPr>
+          <w:color w:val="000000"/>
+        </w:rPr>
+        <w:t>(</w:t>
+      </w:r>
+      <w:proofErr w:type="gramEnd"/>
+      <w:r>
+        <w:rPr>
+          <w:color w:val="000000"/>
+        </w:rPr>
+        <w:t>)</w:t>
       </w:r>
       <w:r>
         <w:rPr>
@@ -475,15 +763,37 @@
         <w:rPr>
           <w:color w:val="000000"/>
         </w:rPr>
-        <w:t>rental_property.on_one_line</w:t>
-      </w:r>
-      <w:proofErr w:type="spellEnd"/>
-      <w:r>
-        <w:rPr>
-          <w:color w:val="000000"/>
-        </w:rPr>
-        <w:t>(bare=True)}}</w:t>
-      </w:r>
+        <w:t>rental_</w:t>
+      </w:r>
+      <w:proofErr w:type="gramStart"/>
+      <w:r>
+        <w:rPr>
+          <w:color w:val="000000"/>
+        </w:rPr>
+        <w:t>property.on</w:t>
+      </w:r>
+      <w:proofErr w:type="gramEnd"/>
+      <w:r>
+        <w:rPr>
+          <w:color w:val="000000"/>
+        </w:rPr>
+        <w:t>_one_line</w:t>
+      </w:r>
+      <w:proofErr w:type="spellEnd"/>
+      <w:r>
+        <w:rPr>
+          <w:color w:val="000000"/>
+        </w:rPr>
+        <w:t>(bare=</w:t>
+      </w:r>
+      <w:proofErr w:type="gramStart"/>
+      <w:r>
+        <w:rPr>
+          <w:color w:val="000000"/>
+        </w:rPr>
+        <w:t>True)}}</w:t>
+      </w:r>
+      <w:proofErr w:type="gramEnd"/>
       <w:r>
         <w:rPr>
           <w:color w:val="000000"/>
@@ -630,7 +940,14 @@
         <w:rPr>
           <w:color w:val="000000"/>
         </w:rPr>
-        <w:t>The issue</w:t>
+        <w:t xml:space="preserve">The </w:t>
+      </w:r>
+      <w:proofErr w:type="gramStart"/>
+      <w:r>
+        <w:rPr>
+          <w:color w:val="000000"/>
+        </w:rPr>
+        <w:t>issue</w:t>
       </w:r>
       <w:r>
         <w:rPr>
@@ -638,6 +955,7 @@
         </w:rPr>
         <w:t>(s)</w:t>
       </w:r>
+      <w:proofErr w:type="gramEnd"/>
       <w:r>
         <w:rPr>
           <w:color w:val="000000"/>
@@ -705,7 +1023,14 @@
         <w:rPr>
           <w:color w:val="000000"/>
         </w:rPr>
-        <w:t>has_an_ordinance</w:t>
+        <w:t>has_an_</w:t>
+      </w:r>
+      <w:proofErr w:type="gramStart"/>
+      <w:r>
+        <w:rPr>
+          <w:color w:val="000000"/>
+        </w:rPr>
+        <w:t>ordinance</w:t>
       </w:r>
       <w:proofErr w:type="spellEnd"/>
       <w:r>
@@ -714,6 +1039,7 @@
         </w:rPr>
         <w:t xml:space="preserve"> %}</w:t>
       </w:r>
+      <w:proofErr w:type="gramEnd"/>
     </w:p>
     <w:p>
       <w:pPr>
@@ -955,6 +1281,7 @@
         <w:t xml:space="preserve">{% </w:t>
       </w:r>
       <w:proofErr w:type="spellStart"/>
+      <w:proofErr w:type="gramStart"/>
       <w:r>
         <w:rPr>
           <w:color w:val="000000"/>
@@ -966,14 +1293,28 @@
         <w:rPr>
           <w:color w:val="000000"/>
         </w:rPr>
-        <w:t xml:space="preserve">  not </w:t>
-      </w:r>
-      <w:proofErr w:type="spellStart"/>
-      <w:r>
-        <w:rPr>
-          <w:color w:val="000000"/>
-        </w:rPr>
-        <w:t>utility_issue</w:t>
+        <w:t xml:space="preserve">  not</w:t>
+      </w:r>
+      <w:proofErr w:type="gramEnd"/>
+      <w:r>
+        <w:rPr>
+          <w:color w:val="000000"/>
+        </w:rPr>
+        <w:t xml:space="preserve"> </w:t>
+      </w:r>
+      <w:proofErr w:type="spellStart"/>
+      <w:r>
+        <w:rPr>
+          <w:color w:val="000000"/>
+        </w:rPr>
+        <w:t>utility_</w:t>
+      </w:r>
+      <w:proofErr w:type="gramStart"/>
+      <w:r>
+        <w:rPr>
+          <w:color w:val="000000"/>
+        </w:rPr>
+        <w:t>issue</w:t>
       </w:r>
       <w:proofErr w:type="spellEnd"/>
       <w:r>
@@ -982,6 +1323,7 @@
         </w:rPr>
         <w:t xml:space="preserve"> %}</w:t>
       </w:r>
+      <w:proofErr w:type="gramEnd"/>
     </w:p>
     <w:p>
       <w:pPr>
@@ -1108,13 +1450,27 @@
         <w:rPr>
           <w:color w:val="000000"/>
         </w:rPr>
-        <w:t>. Under the law, Illinois tenants have a right to habitable housing. Additionally, if you do not make necessary repairs, you may be in violation of our lease agreement.</w:t>
-      </w:r>
-      <w:r>
-        <w:rPr>
-          <w:color w:val="000000"/>
-        </w:rPr>
-        <w:t xml:space="preserve">{% if </w:t>
+        <w:t xml:space="preserve">. Under the law, Illinois tenants have a right to habitable housing. Additionally, if you do not make necessary repairs, you may be in violation of our lease </w:t>
+      </w:r>
+      <w:proofErr w:type="gramStart"/>
+      <w:r>
+        <w:rPr>
+          <w:color w:val="000000"/>
+        </w:rPr>
+        <w:t>agreement.</w:t>
+      </w:r>
+      <w:r>
+        <w:rPr>
+          <w:color w:val="000000"/>
+        </w:rPr>
+        <w:t>{</w:t>
+      </w:r>
+      <w:proofErr w:type="gramEnd"/>
+      <w:r>
+        <w:rPr>
+          <w:color w:val="000000"/>
+        </w:rPr>
+        <w:t xml:space="preserve">% if </w:t>
       </w:r>
       <w:proofErr w:type="spellStart"/>
       <w:r>
@@ -1134,14 +1490,36 @@
         <w:rPr>
           <w:color w:val="000000"/>
         </w:rPr>
-        <w:t>As this issue is a disruption of essential services, I may contact the local building department.</w:t>
-      </w:r>
-      <w:r>
-        <w:rPr>
-          <w:color w:val="000000"/>
-        </w:rPr>
-        <w:t>{% endif %}</w:t>
-      </w:r>
+        <w:t xml:space="preserve">As this issue is a disruption of essential services, I may contact the local building </w:t>
+      </w:r>
+      <w:proofErr w:type="gramStart"/>
+      <w:r>
+        <w:rPr>
+          <w:color w:val="000000"/>
+        </w:rPr>
+        <w:t>department.</w:t>
+      </w:r>
+      <w:r>
+        <w:rPr>
+          <w:color w:val="000000"/>
+        </w:rPr>
+        <w:t>{</w:t>
+      </w:r>
+      <w:proofErr w:type="gramEnd"/>
+      <w:r>
+        <w:rPr>
+          <w:color w:val="000000"/>
+        </w:rPr>
+        <w:t xml:space="preserve">% </w:t>
+      </w:r>
+      <w:proofErr w:type="gramStart"/>
+      <w:r>
+        <w:rPr>
+          <w:color w:val="000000"/>
+        </w:rPr>
+        <w:t>endif %}</w:t>
+      </w:r>
+      <w:proofErr w:type="gramEnd"/>
     </w:p>
     <w:p>
       <w:pPr>
@@ -1177,7 +1555,14 @@
         <w:rPr>
           <w:color w:val="000000"/>
         </w:rPr>
-        <w:t>utility_issue</w:t>
+        <w:t>utility_</w:t>
+      </w:r>
+      <w:proofErr w:type="gramStart"/>
+      <w:r>
+        <w:rPr>
+          <w:color w:val="000000"/>
+        </w:rPr>
+        <w:t>issue</w:t>
       </w:r>
       <w:proofErr w:type="spellEnd"/>
       <w:r>
@@ -1186,6 +1571,7 @@
         </w:rPr>
         <w:t xml:space="preserve"> %}</w:t>
       </w:r>
+      <w:proofErr w:type="gramEnd"/>
     </w:p>
     <w:p>
       <w:pPr>
@@ -1206,19 +1592,47 @@
         <w:rPr>
           <w:color w:val="000000"/>
         </w:rPr>
-        <w:t>As this issue is a disruption of essential services, I may contact the local building department.</w:t>
-      </w:r>
-      <w:r>
-        <w:rPr>
-          <w:color w:val="000000"/>
-        </w:rPr>
-        <w:t>{% endif %}</w:t>
-      </w:r>
-      <w:r>
-        <w:rPr>
-          <w:color w:val="000000"/>
-        </w:rPr>
-        <w:t xml:space="preserve">{% if </w:t>
+        <w:t xml:space="preserve">As this issue is a disruption of essential services, I may contact the local building </w:t>
+      </w:r>
+      <w:proofErr w:type="gramStart"/>
+      <w:r>
+        <w:rPr>
+          <w:color w:val="000000"/>
+        </w:rPr>
+        <w:t>department.</w:t>
+      </w:r>
+      <w:r>
+        <w:rPr>
+          <w:color w:val="000000"/>
+        </w:rPr>
+        <w:t>{</w:t>
+      </w:r>
+      <w:proofErr w:type="gramEnd"/>
+      <w:r>
+        <w:rPr>
+          <w:color w:val="000000"/>
+        </w:rPr>
+        <w:t xml:space="preserve">% endif </w:t>
+      </w:r>
+      <w:proofErr w:type="gramStart"/>
+      <w:r>
+        <w:rPr>
+          <w:color w:val="000000"/>
+        </w:rPr>
+        <w:t>%}</w:t>
+      </w:r>
+      <w:r>
+        <w:rPr>
+          <w:color w:val="000000"/>
+        </w:rPr>
+        <w:t>{</w:t>
+      </w:r>
+      <w:proofErr w:type="gramEnd"/>
+      <w:r>
+        <w:rPr>
+          <w:color w:val="000000"/>
+        </w:rPr>
+        <w:t xml:space="preserve">% if </w:t>
       </w:r>
       <w:proofErr w:type="spellStart"/>
       <w:r>
@@ -1232,27 +1646,55 @@
         <w:rPr>
           <w:color w:val="000000"/>
         </w:rPr>
-        <w:t xml:space="preserve"> %}</w:t>
-      </w:r>
-      <w:r>
-        <w:rPr>
-          <w:color w:val="000000"/>
-        </w:rPr>
-        <w:t xml:space="preserve">{% if </w:t>
-      </w:r>
-      <w:proofErr w:type="spellStart"/>
-      <w:r>
-        <w:rPr>
-          <w:color w:val="000000"/>
-        </w:rPr>
-        <w:t>repair_or_inspect_text</w:t>
-      </w:r>
-      <w:proofErr w:type="spellEnd"/>
-      <w:r>
-        <w:rPr>
-          <w:color w:val="000000"/>
-        </w:rPr>
-        <w:t xml:space="preserve"> != “” %}</w:t>
+        <w:t xml:space="preserve"> </w:t>
+      </w:r>
+      <w:proofErr w:type="gramStart"/>
+      <w:r>
+        <w:rPr>
+          <w:color w:val="000000"/>
+        </w:rPr>
+        <w:t>%}</w:t>
+      </w:r>
+      <w:r>
+        <w:rPr>
+          <w:color w:val="000000"/>
+        </w:rPr>
+        <w:t>{</w:t>
+      </w:r>
+      <w:proofErr w:type="gramEnd"/>
+      <w:r>
+        <w:rPr>
+          <w:color w:val="000000"/>
+        </w:rPr>
+        <w:t xml:space="preserve">% if </w:t>
+      </w:r>
+      <w:proofErr w:type="spellStart"/>
+      <w:r>
+        <w:rPr>
+          <w:color w:val="000000"/>
+        </w:rPr>
+        <w:t>repair_or_inspect_</w:t>
+      </w:r>
+      <w:proofErr w:type="gramStart"/>
+      <w:r>
+        <w:rPr>
+          <w:color w:val="000000"/>
+        </w:rPr>
+        <w:t>text</w:t>
+      </w:r>
+      <w:proofErr w:type="spellEnd"/>
+      <w:r>
+        <w:rPr>
+          <w:color w:val="000000"/>
+        </w:rPr>
+        <w:t xml:space="preserve"> !</w:t>
+      </w:r>
+      <w:proofErr w:type="gramEnd"/>
+      <w:r>
+        <w:rPr>
+          <w:color w:val="000000"/>
+        </w:rPr>
+        <w:t>= “” %}</w:t>
       </w:r>
     </w:p>
     <w:p>
@@ -1290,31 +1732,81 @@
         <w:t>repair_or_inspect_text</w:t>
       </w:r>
       <w:proofErr w:type="spellEnd"/>
-      <w:r>
-        <w:rPr>
-          <w:color w:val="000000"/>
-        </w:rPr>
-        <w:t>}}{% endif %}</w:t>
-      </w:r>
-      <w:r>
-        <w:rPr>
-          <w:color w:val="000000"/>
-        </w:rPr>
-        <w:t xml:space="preserve">{% if </w:t>
-      </w:r>
-      <w:proofErr w:type="spellStart"/>
-      <w:r>
-        <w:rPr>
-          <w:color w:val="000000"/>
-        </w:rPr>
-        <w:t>reduced_value_text</w:t>
-      </w:r>
-      <w:proofErr w:type="spellEnd"/>
-      <w:r>
-        <w:rPr>
-          <w:color w:val="000000"/>
-        </w:rPr>
-        <w:t xml:space="preserve">  != “”%}</w:t>
+      <w:proofErr w:type="gramStart"/>
+      <w:r>
+        <w:rPr>
+          <w:color w:val="000000"/>
+        </w:rPr>
+        <w:t>}}{</w:t>
+      </w:r>
+      <w:proofErr w:type="gramEnd"/>
+      <w:r>
+        <w:rPr>
+          <w:color w:val="000000"/>
+        </w:rPr>
+        <w:t xml:space="preserve">% endif </w:t>
+      </w:r>
+      <w:proofErr w:type="gramStart"/>
+      <w:r>
+        <w:rPr>
+          <w:color w:val="000000"/>
+        </w:rPr>
+        <w:t>%}</w:t>
+      </w:r>
+      <w:r>
+        <w:rPr>
+          <w:color w:val="000000"/>
+        </w:rPr>
+        <w:t>{</w:t>
+      </w:r>
+      <w:proofErr w:type="gramEnd"/>
+      <w:r>
+        <w:rPr>
+          <w:color w:val="000000"/>
+        </w:rPr>
+        <w:t xml:space="preserve">% if </w:t>
+      </w:r>
+      <w:proofErr w:type="spellStart"/>
+      <w:r>
+        <w:rPr>
+          <w:color w:val="000000"/>
+        </w:rPr>
+        <w:t>reduced_value_</w:t>
+      </w:r>
+      <w:proofErr w:type="gramStart"/>
+      <w:r>
+        <w:rPr>
+          <w:color w:val="000000"/>
+        </w:rPr>
+        <w:t>text</w:t>
+      </w:r>
+      <w:proofErr w:type="spellEnd"/>
+      <w:r>
+        <w:rPr>
+          <w:color w:val="000000"/>
+        </w:rPr>
+        <w:t xml:space="preserve">  !</w:t>
+      </w:r>
+      <w:proofErr w:type="gramEnd"/>
+      <w:r>
+        <w:rPr>
+          <w:color w:val="000000"/>
+        </w:rPr>
+        <w:t xml:space="preserve">= </w:t>
+      </w:r>
+      <w:proofErr w:type="gramStart"/>
+      <w:r>
+        <w:rPr>
+          <w:color w:val="000000"/>
+        </w:rPr>
+        <w:t>“”%</w:t>
+      </w:r>
+      <w:proofErr w:type="gramEnd"/>
+      <w:r>
+        <w:rPr>
+          <w:color w:val="000000"/>
+        </w:rPr>
+        <w:t>}</w:t>
       </w:r>
     </w:p>
     <w:p>
@@ -1348,6 +1840,7 @@
         </w:rPr>
         <w:t xml:space="preserve"> </w:t>
       </w:r>
+      <w:proofErr w:type="gramStart"/>
       <w:r>
         <w:rPr>
           <w:color w:val="000000"/>
@@ -1359,34 +1852,77 @@
         <w:rPr>
           <w:color w:val="000000"/>
         </w:rPr>
-        <w:t>reduced_value_text</w:t>
-      </w:r>
-      <w:proofErr w:type="spellEnd"/>
-      <w:r>
-        <w:rPr>
-          <w:color w:val="000000"/>
-        </w:rPr>
-        <w:t>}}{% endif %}</w:t>
-      </w:r>
-      <w:r>
-        <w:rPr>
-          <w:color w:val="000000"/>
-        </w:rPr>
-        <w:t xml:space="preserve">{% if </w:t>
-      </w:r>
-      <w:proofErr w:type="spellStart"/>
-      <w:r>
-        <w:rPr>
-          <w:color w:val="000000"/>
-        </w:rPr>
-        <w:t>sub_housing_text</w:t>
-      </w:r>
-      <w:proofErr w:type="spellEnd"/>
-      <w:r>
-        <w:rPr>
-          <w:color w:val="000000"/>
-        </w:rPr>
-        <w:t xml:space="preserve"> != “” %}</w:t>
+        <w:t>reduced</w:t>
+      </w:r>
+      <w:proofErr w:type="gramEnd"/>
+      <w:r>
+        <w:rPr>
+          <w:color w:val="000000"/>
+        </w:rPr>
+        <w:t>_value_text</w:t>
+      </w:r>
+      <w:proofErr w:type="spellEnd"/>
+      <w:proofErr w:type="gramStart"/>
+      <w:r>
+        <w:rPr>
+          <w:color w:val="000000"/>
+        </w:rPr>
+        <w:t>}}{</w:t>
+      </w:r>
+      <w:proofErr w:type="gramEnd"/>
+      <w:r>
+        <w:rPr>
+          <w:color w:val="000000"/>
+        </w:rPr>
+        <w:t xml:space="preserve">% endif </w:t>
+      </w:r>
+      <w:proofErr w:type="gramStart"/>
+      <w:r>
+        <w:rPr>
+          <w:color w:val="000000"/>
+        </w:rPr>
+        <w:t>%}</w:t>
+      </w:r>
+      <w:r>
+        <w:rPr>
+          <w:color w:val="000000"/>
+        </w:rPr>
+        <w:t>{</w:t>
+      </w:r>
+      <w:proofErr w:type="gramEnd"/>
+      <w:r>
+        <w:rPr>
+          <w:color w:val="000000"/>
+        </w:rPr>
+        <w:t xml:space="preserve">% if </w:t>
+      </w:r>
+      <w:proofErr w:type="spellStart"/>
+      <w:r>
+        <w:rPr>
+          <w:color w:val="000000"/>
+        </w:rPr>
+        <w:t>sub_housing_</w:t>
+      </w:r>
+      <w:proofErr w:type="gramStart"/>
+      <w:r>
+        <w:rPr>
+          <w:color w:val="000000"/>
+        </w:rPr>
+        <w:t>text</w:t>
+      </w:r>
+      <w:proofErr w:type="spellEnd"/>
+      <w:r>
+        <w:rPr>
+          <w:color w:val="000000"/>
+        </w:rPr>
+        <w:t xml:space="preserve"> !</w:t>
+      </w:r>
+      <w:proofErr w:type="gramEnd"/>
+      <w:r>
+        <w:rPr>
+          <w:color w:val="000000"/>
+        </w:rPr>
+        <w:t>= “” %}</w:t>
       </w:r>
     </w:p>
     <w:p>
@@ -1434,31 +1970,67 @@
         <w:t>sub_housing_text</w:t>
       </w:r>
       <w:proofErr w:type="spellEnd"/>
-      <w:r>
-        <w:rPr>
-          <w:color w:val="000000"/>
-        </w:rPr>
-        <w:t>}}{% endif %}</w:t>
-      </w:r>
-      <w:r>
-        <w:rPr>
-          <w:color w:val="000000"/>
-        </w:rPr>
-        <w:t xml:space="preserve">{% if </w:t>
-      </w:r>
-      <w:proofErr w:type="spellStart"/>
-      <w:r>
-        <w:rPr>
-          <w:color w:val="000000"/>
-        </w:rPr>
-        <w:t>termination_text</w:t>
-      </w:r>
-      <w:proofErr w:type="spellEnd"/>
-      <w:r>
-        <w:rPr>
-          <w:color w:val="000000"/>
-        </w:rPr>
-        <w:t xml:space="preserve"> != “” %}</w:t>
+      <w:proofErr w:type="gramStart"/>
+      <w:r>
+        <w:rPr>
+          <w:color w:val="000000"/>
+        </w:rPr>
+        <w:t>}}{</w:t>
+      </w:r>
+      <w:proofErr w:type="gramEnd"/>
+      <w:r>
+        <w:rPr>
+          <w:color w:val="000000"/>
+        </w:rPr>
+        <w:t xml:space="preserve">% endif </w:t>
+      </w:r>
+      <w:proofErr w:type="gramStart"/>
+      <w:r>
+        <w:rPr>
+          <w:color w:val="000000"/>
+        </w:rPr>
+        <w:t>%}</w:t>
+      </w:r>
+      <w:r>
+        <w:rPr>
+          <w:color w:val="000000"/>
+        </w:rPr>
+        <w:t>{</w:t>
+      </w:r>
+      <w:proofErr w:type="gramEnd"/>
+      <w:r>
+        <w:rPr>
+          <w:color w:val="000000"/>
+        </w:rPr>
+        <w:t xml:space="preserve">% if </w:t>
+      </w:r>
+      <w:proofErr w:type="spellStart"/>
+      <w:r>
+        <w:rPr>
+          <w:color w:val="000000"/>
+        </w:rPr>
+        <w:t>termination_</w:t>
+      </w:r>
+      <w:proofErr w:type="gramStart"/>
+      <w:r>
+        <w:rPr>
+          <w:color w:val="000000"/>
+        </w:rPr>
+        <w:t>text</w:t>
+      </w:r>
+      <w:proofErr w:type="spellEnd"/>
+      <w:r>
+        <w:rPr>
+          <w:color w:val="000000"/>
+        </w:rPr>
+        <w:t xml:space="preserve"> !</w:t>
+      </w:r>
+      <w:proofErr w:type="gramEnd"/>
+      <w:r>
+        <w:rPr>
+          <w:color w:val="000000"/>
+        </w:rPr>
+        <w:t>= “” %}</w:t>
       </w:r>
     </w:p>
     <w:p>
@@ -1503,6 +2075,7 @@
         <w:t>termination_text</w:t>
       </w:r>
       <w:proofErr w:type="spellEnd"/>
+      <w:proofErr w:type="gramStart"/>
       <w:r>
         <w:rPr>
           <w:color w:val="000000"/>
@@ -1510,11 +2083,28 @@
         <w:t>}}</w:t>
       </w:r>
       <w:r>
-        <w:t>{% endif %}</w:t>
-      </w:r>
-      <w:r>
-        <w:t>{% endif %}</w:t>
-      </w:r>
+        <w:t>{</w:t>
+      </w:r>
+      <w:proofErr w:type="gramEnd"/>
+      <w:r>
+        <w:t xml:space="preserve">% endif </w:t>
+      </w:r>
+      <w:proofErr w:type="gramStart"/>
+      <w:r>
+        <w:t>%}</w:t>
+      </w:r>
+      <w:r>
+        <w:t>{</w:t>
+      </w:r>
+      <w:proofErr w:type="gramEnd"/>
+      <w:r>
+        <w:t xml:space="preserve">% </w:t>
+      </w:r>
+      <w:proofErr w:type="gramStart"/>
+      <w:r>
+        <w:t>endif %}</w:t>
+      </w:r>
+      <w:proofErr w:type="gramEnd"/>
     </w:p>
     <w:p>
       <w:pPr>
@@ -1540,7 +2130,6 @@
         <w:rPr>
           <w:color w:val="000000"/>
         </w:rPr>
-        <w:lastRenderedPageBreak/>
         <w:t xml:space="preserve">{% if </w:t>
       </w:r>
       <w:proofErr w:type="spellStart"/>
@@ -1548,14 +2137,42 @@
         <w:rPr>
           <w:color w:val="000000"/>
         </w:rPr>
-        <w:t>specific_citation</w:t>
-      </w:r>
-      <w:proofErr w:type="spellEnd"/>
-      <w:r>
-        <w:rPr>
-          <w:color w:val="000000"/>
-        </w:rPr>
-        <w:t xml:space="preserve"> != “not applicable” %}You can learn more about remedies available to me as a tenant in {{</w:t>
+        <w:t>specific_</w:t>
+      </w:r>
+      <w:proofErr w:type="gramStart"/>
+      <w:r>
+        <w:rPr>
+          <w:color w:val="000000"/>
+        </w:rPr>
+        <w:t>citation</w:t>
+      </w:r>
+      <w:proofErr w:type="spellEnd"/>
+      <w:r>
+        <w:rPr>
+          <w:color w:val="000000"/>
+        </w:rPr>
+        <w:t xml:space="preserve"> !</w:t>
+      </w:r>
+      <w:proofErr w:type="gramEnd"/>
+      <w:r>
+        <w:rPr>
+          <w:color w:val="000000"/>
+        </w:rPr>
+        <w:t xml:space="preserve">= “not applicable” </w:t>
+      </w:r>
+      <w:proofErr w:type="gramStart"/>
+      <w:r>
+        <w:rPr>
+          <w:color w:val="000000"/>
+        </w:rPr>
+        <w:t>%}You</w:t>
+      </w:r>
+      <w:proofErr w:type="gramEnd"/>
+      <w:r>
+        <w:rPr>
+          <w:color w:val="000000"/>
+        </w:rPr>
+        <w:t xml:space="preserve"> can learn more about remedies available to me as a tenant in {{</w:t>
       </w:r>
       <w:proofErr w:type="spellStart"/>
       <w:r>
@@ -1569,13 +2186,27 @@
         <w:rPr>
           <w:color w:val="000000"/>
         </w:rPr>
-        <w:t>}}. {% endif %}</w:t>
-      </w:r>
-      <w:r>
-        <w:rPr>
-          <w:color w:val="000000"/>
-        </w:rPr>
-        <w:t>Please let me know if you need more information. Thank you for your assistance with this issue.</w:t>
+        <w:t xml:space="preserve">}}. {% endif </w:t>
+      </w:r>
+      <w:proofErr w:type="gramStart"/>
+      <w:r>
+        <w:rPr>
+          <w:color w:val="000000"/>
+        </w:rPr>
+        <w:t>%}</w:t>
+      </w:r>
+      <w:r>
+        <w:rPr>
+          <w:color w:val="000000"/>
+        </w:rPr>
+        <w:t>Please</w:t>
+      </w:r>
+      <w:proofErr w:type="gramEnd"/>
+      <w:r>
+        <w:rPr>
+          <w:color w:val="000000"/>
+        </w:rPr>
+        <w:t xml:space="preserve"> let me know if you need more information. Thank you for your assistance with this issue.</w:t>
       </w:r>
     </w:p>
     <w:p>
@@ -1670,9 +2301,9 @@
           <w:sz w:val="24"/>
           <w:szCs w:val="24"/>
         </w:rPr>
-        <w:t>name_full</w:t>
-      </w:r>
-      <w:proofErr w:type="spellEnd"/>
+        <w:t>name_</w:t>
+      </w:r>
+      <w:proofErr w:type="gramStart"/>
       <w:r>
         <w:rPr>
           <w:rFonts w:ascii="Times New Roman" w:hAnsi="Times New Roman" w:cs="Times New Roman"/>
@@ -1680,8 +2311,9 @@
           <w:sz w:val="24"/>
           <w:szCs w:val="24"/>
         </w:rPr>
-        <w:t>()</w:t>
-      </w:r>
+        <w:t>full</w:t>
+      </w:r>
+      <w:proofErr w:type="spellEnd"/>
       <w:r>
         <w:rPr>
           <w:rFonts w:ascii="Times New Roman" w:hAnsi="Times New Roman" w:cs="Times New Roman"/>
@@ -1689,6 +2321,25 @@
           <w:sz w:val="24"/>
           <w:szCs w:val="24"/>
         </w:rPr>
+        <w:t>(</w:t>
+      </w:r>
+      <w:proofErr w:type="gramEnd"/>
+      <w:r>
+        <w:rPr>
+          <w:rFonts w:ascii="Times New Roman" w:hAnsi="Times New Roman" w:cs="Times New Roman"/>
+          <w:color w:val="000000"/>
+          <w:sz w:val="24"/>
+          <w:szCs w:val="24"/>
+        </w:rPr>
+        <w:t>)</w:t>
+      </w:r>
+      <w:r>
+        <w:rPr>
+          <w:rFonts w:ascii="Times New Roman" w:hAnsi="Times New Roman" w:cs="Times New Roman"/>
+          <w:color w:val="000000"/>
+          <w:sz w:val="24"/>
+          <w:szCs w:val="24"/>
+        </w:rPr>
         <w:t>}}</w:t>
       </w:r>
     </w:p>
@@ -1710,9 +2361,9 @@
           <w:sz w:val="24"/>
           <w:szCs w:val="24"/>
         </w:rPr>
-        <w:t>{% if users[0].</w:t>
-      </w:r>
-      <w:proofErr w:type="spellStart"/>
+        <w:t xml:space="preserve">{% if </w:t>
+      </w:r>
+      <w:proofErr w:type="gramStart"/>
       <w:r>
         <w:rPr>
           <w:rFonts w:ascii="Times New Roman" w:hAnsi="Times New Roman" w:cs="Times New Roman"/>
@@ -1720,9 +2371,9 @@
           <w:sz w:val="24"/>
           <w:szCs w:val="24"/>
         </w:rPr>
-        <w:t>phone_number</w:t>
-      </w:r>
-      <w:proofErr w:type="spellEnd"/>
+        <w:t>users[</w:t>
+      </w:r>
+      <w:proofErr w:type="gramEnd"/>
       <w:r>
         <w:rPr>
           <w:rFonts w:ascii="Times New Roman" w:hAnsi="Times New Roman" w:cs="Times New Roman"/>
@@ -1730,9 +2381,9 @@
           <w:sz w:val="24"/>
           <w:szCs w:val="24"/>
         </w:rPr>
-        <w:t xml:space="preserve"> != “” %}{{</w:t>
-      </w:r>
-      <w:proofErr w:type="spellStart"/>
+        <w:t>0</w:t>
+      </w:r>
+      <w:proofErr w:type="gramStart"/>
       <w:r>
         <w:rPr>
           <w:rFonts w:ascii="Times New Roman" w:hAnsi="Times New Roman" w:cs="Times New Roman"/>
@@ -1740,9 +2391,9 @@
           <w:sz w:val="24"/>
           <w:szCs w:val="24"/>
         </w:rPr>
-        <w:t>phone_number_formatted</w:t>
-      </w:r>
-      <w:proofErr w:type="spellEnd"/>
+        <w:t>].</w:t>
+      </w:r>
+      <w:proofErr w:type="spellStart"/>
       <w:r>
         <w:rPr>
           <w:rFonts w:ascii="Times New Roman" w:hAnsi="Times New Roman" w:cs="Times New Roman"/>
@@ -1750,9 +2401,9 @@
           <w:sz w:val="24"/>
           <w:szCs w:val="24"/>
         </w:rPr>
-        <w:t>(users[0].</w:t>
-      </w:r>
-      <w:proofErr w:type="spellStart"/>
+        <w:t>phone</w:t>
+      </w:r>
+      <w:proofErr w:type="gramEnd"/>
       <w:r>
         <w:rPr>
           <w:rFonts w:ascii="Times New Roman" w:hAnsi="Times New Roman" w:cs="Times New Roman"/>
@@ -1760,9 +2411,9 @@
           <w:sz w:val="24"/>
           <w:szCs w:val="24"/>
         </w:rPr>
-        <w:t>phone_number</w:t>
-      </w:r>
-      <w:proofErr w:type="spellEnd"/>
+        <w:t>_</w:t>
+      </w:r>
+      <w:proofErr w:type="gramStart"/>
       <w:r>
         <w:rPr>
           <w:rFonts w:ascii="Times New Roman" w:hAnsi="Times New Roman" w:cs="Times New Roman"/>
@@ -1770,6 +2421,106 @@
           <w:sz w:val="24"/>
           <w:szCs w:val="24"/>
         </w:rPr>
+        <w:t>number</w:t>
+      </w:r>
+      <w:proofErr w:type="spellEnd"/>
+      <w:r>
+        <w:rPr>
+          <w:rFonts w:ascii="Times New Roman" w:hAnsi="Times New Roman" w:cs="Times New Roman"/>
+          <w:color w:val="000000"/>
+          <w:sz w:val="24"/>
+          <w:szCs w:val="24"/>
+        </w:rPr>
+        <w:t xml:space="preserve"> !</w:t>
+      </w:r>
+      <w:proofErr w:type="gramEnd"/>
+      <w:r>
+        <w:rPr>
+          <w:rFonts w:ascii="Times New Roman" w:hAnsi="Times New Roman" w:cs="Times New Roman"/>
+          <w:color w:val="000000"/>
+          <w:sz w:val="24"/>
+          <w:szCs w:val="24"/>
+        </w:rPr>
+        <w:t xml:space="preserve">= “” </w:t>
+      </w:r>
+      <w:proofErr w:type="gramStart"/>
+      <w:r>
+        <w:rPr>
+          <w:rFonts w:ascii="Times New Roman" w:hAnsi="Times New Roman" w:cs="Times New Roman"/>
+          <w:color w:val="000000"/>
+          <w:sz w:val="24"/>
+          <w:szCs w:val="24"/>
+        </w:rPr>
+        <w:t>%}{</w:t>
+      </w:r>
+      <w:proofErr w:type="gramEnd"/>
+      <w:r>
+        <w:rPr>
+          <w:rFonts w:ascii="Times New Roman" w:hAnsi="Times New Roman" w:cs="Times New Roman"/>
+          <w:color w:val="000000"/>
+          <w:sz w:val="24"/>
+          <w:szCs w:val="24"/>
+        </w:rPr>
+        <w:t>{</w:t>
+      </w:r>
+      <w:proofErr w:type="spellStart"/>
+      <w:r>
+        <w:rPr>
+          <w:rFonts w:ascii="Times New Roman" w:hAnsi="Times New Roman" w:cs="Times New Roman"/>
+          <w:color w:val="000000"/>
+          <w:sz w:val="24"/>
+          <w:szCs w:val="24"/>
+        </w:rPr>
+        <w:t>phone_number_formatted</w:t>
+      </w:r>
+      <w:proofErr w:type="spellEnd"/>
+      <w:r>
+        <w:rPr>
+          <w:rFonts w:ascii="Times New Roman" w:hAnsi="Times New Roman" w:cs="Times New Roman"/>
+          <w:color w:val="000000"/>
+          <w:sz w:val="24"/>
+          <w:szCs w:val="24"/>
+        </w:rPr>
+        <w:t>(users[0</w:t>
+      </w:r>
+      <w:proofErr w:type="gramStart"/>
+      <w:r>
+        <w:rPr>
+          <w:rFonts w:ascii="Times New Roman" w:hAnsi="Times New Roman" w:cs="Times New Roman"/>
+          <w:color w:val="000000"/>
+          <w:sz w:val="24"/>
+          <w:szCs w:val="24"/>
+        </w:rPr>
+        <w:t>].</w:t>
+      </w:r>
+      <w:proofErr w:type="spellStart"/>
+      <w:r>
+        <w:rPr>
+          <w:rFonts w:ascii="Times New Roman" w:hAnsi="Times New Roman" w:cs="Times New Roman"/>
+          <w:color w:val="000000"/>
+          <w:sz w:val="24"/>
+          <w:szCs w:val="24"/>
+        </w:rPr>
+        <w:t>phone</w:t>
+      </w:r>
+      <w:proofErr w:type="gramEnd"/>
+      <w:r>
+        <w:rPr>
+          <w:rFonts w:ascii="Times New Roman" w:hAnsi="Times New Roman" w:cs="Times New Roman"/>
+          <w:color w:val="000000"/>
+          <w:sz w:val="24"/>
+          <w:szCs w:val="24"/>
+        </w:rPr>
+        <w:t>_number</w:t>
+      </w:r>
+      <w:proofErr w:type="spellEnd"/>
+      <w:r>
+        <w:rPr>
+          <w:rFonts w:ascii="Times New Roman" w:hAnsi="Times New Roman" w:cs="Times New Roman"/>
+          <w:color w:val="000000"/>
+          <w:sz w:val="24"/>
+          <w:szCs w:val="24"/>
+        </w:rPr>
         <w:t>)}}</w:t>
       </w:r>
     </w:p>
@@ -1791,8 +2542,9 @@
           <w:sz w:val="24"/>
           <w:szCs w:val="24"/>
         </w:rPr>
-        <w:t>{% endif %}{% if users[0].email != “” %}{{users[0].email}}</w:t>
-      </w:r>
+        <w:t xml:space="preserve">{% endif </w:t>
+      </w:r>
+      <w:proofErr w:type="gramStart"/>
       <w:r>
         <w:rPr>
           <w:rFonts w:ascii="Times New Roman" w:hAnsi="Times New Roman" w:cs="Times New Roman"/>
@@ -1800,13 +2552,112 @@
           <w:sz w:val="24"/>
           <w:szCs w:val="24"/>
         </w:rPr>
-        <w:t>{% endif %}</w:t>
+        <w:t>%}{</w:t>
+      </w:r>
+      <w:proofErr w:type="gramEnd"/>
+      <w:r>
+        <w:rPr>
+          <w:rFonts w:ascii="Times New Roman" w:hAnsi="Times New Roman" w:cs="Times New Roman"/>
+          <w:color w:val="000000"/>
+          <w:sz w:val="24"/>
+          <w:szCs w:val="24"/>
+        </w:rPr>
+        <w:t xml:space="preserve">% if </w:t>
+      </w:r>
+      <w:proofErr w:type="gramStart"/>
+      <w:r>
+        <w:rPr>
+          <w:rFonts w:ascii="Times New Roman" w:hAnsi="Times New Roman" w:cs="Times New Roman"/>
+          <w:color w:val="000000"/>
+          <w:sz w:val="24"/>
+          <w:szCs w:val="24"/>
+        </w:rPr>
+        <w:t>users[</w:t>
+      </w:r>
+      <w:proofErr w:type="gramEnd"/>
+      <w:r>
+        <w:rPr>
+          <w:rFonts w:ascii="Times New Roman" w:hAnsi="Times New Roman" w:cs="Times New Roman"/>
+          <w:color w:val="000000"/>
+          <w:sz w:val="24"/>
+          <w:szCs w:val="24"/>
+        </w:rPr>
+        <w:t>0</w:t>
+      </w:r>
+      <w:proofErr w:type="gramStart"/>
+      <w:r>
+        <w:rPr>
+          <w:rFonts w:ascii="Times New Roman" w:hAnsi="Times New Roman" w:cs="Times New Roman"/>
+          <w:color w:val="000000"/>
+          <w:sz w:val="24"/>
+          <w:szCs w:val="24"/>
+        </w:rPr>
+        <w:t>].email !=</w:t>
+      </w:r>
+      <w:proofErr w:type="gramEnd"/>
+      <w:r>
+        <w:rPr>
+          <w:rFonts w:ascii="Times New Roman" w:hAnsi="Times New Roman" w:cs="Times New Roman"/>
+          <w:color w:val="000000"/>
+          <w:sz w:val="24"/>
+          <w:szCs w:val="24"/>
+        </w:rPr>
+        <w:t xml:space="preserve"> “” </w:t>
+      </w:r>
+      <w:proofErr w:type="gramStart"/>
+      <w:r>
+        <w:rPr>
+          <w:rFonts w:ascii="Times New Roman" w:hAnsi="Times New Roman" w:cs="Times New Roman"/>
+          <w:color w:val="000000"/>
+          <w:sz w:val="24"/>
+          <w:szCs w:val="24"/>
+        </w:rPr>
+        <w:t>%}{</w:t>
+      </w:r>
+      <w:proofErr w:type="gramEnd"/>
+      <w:r>
+        <w:rPr>
+          <w:rFonts w:ascii="Times New Roman" w:hAnsi="Times New Roman" w:cs="Times New Roman"/>
+          <w:color w:val="000000"/>
+          <w:sz w:val="24"/>
+          <w:szCs w:val="24"/>
+        </w:rPr>
+        <w:t>{users[0</w:t>
+      </w:r>
+      <w:proofErr w:type="gramStart"/>
+      <w:r>
+        <w:rPr>
+          <w:rFonts w:ascii="Times New Roman" w:hAnsi="Times New Roman" w:cs="Times New Roman"/>
+          <w:color w:val="000000"/>
+          <w:sz w:val="24"/>
+          <w:szCs w:val="24"/>
+        </w:rPr>
+        <w:t>].email}}</w:t>
+      </w:r>
+      <w:r>
+        <w:rPr>
+          <w:rFonts w:ascii="Times New Roman" w:hAnsi="Times New Roman" w:cs="Times New Roman"/>
+          <w:color w:val="000000"/>
+          <w:sz w:val="24"/>
+          <w:szCs w:val="24"/>
+        </w:rPr>
+        <w:t>{</w:t>
+      </w:r>
+      <w:proofErr w:type="gramEnd"/>
+      <w:r>
+        <w:rPr>
+          <w:rFonts w:ascii="Times New Roman" w:hAnsi="Times New Roman" w:cs="Times New Roman"/>
+          <w:color w:val="000000"/>
+          <w:sz w:val="24"/>
+          <w:szCs w:val="24"/>
+        </w:rPr>
+        <w:t>% endif %}</w:t>
       </w:r>
     </w:p>
     <w:sectPr>
       <w:footerReference w:type="default" r:id="rId6"/>
       <w:pgSz w:w="12240" w:h="15840"/>
-      <w:pgMar w:top="360" w:right="720" w:bottom="360" w:left="720" w:header="720" w:footer="360" w:gutter="0"/>
+      <w:pgMar w:top="1440" w:right="1440" w:bottom="1440" w:left="1440" w:header="720" w:footer="360" w:gutter="0"/>
       <w:cols w:space="720"/>
       <w:docGrid w:linePitch="360"/>
     </w:sectPr>

</xml_diff>